<commit_message>
Align mapping table and README declaration count to exactly 21 audited declarations
</commit_message>
<xml_diff>
--- a/Riemann Zeta/Paper_Riemann_Zeta_v7.docx
+++ b/Riemann Zeta/Paper_Riemann_Zeta_v7.docx
@@ -93,7 +93,7 @@
         <w:rPr>
           <w:rStyle w:val="VerbatimChar"/>
         </w:rPr>
-        <w:t xml:space="preserve">81439b5</w:t>
+        <w:t xml:space="preserve">d6c7c51</w:t>
       </w:r>
       <w:r>
         <w:t xml:space="preserve"> </w:t>
@@ -3309,6 +3309,59 @@
         </m:r>
       </m:oMath>
       <w:r>
+        <w:t xml:space="preserve"> </w:t>
+      </w:r>
+      <w:r>
+        <w:t xml:space="preserve">and</w:t>
+      </w:r>
+      <w:r>
+        <w:t xml:space="preserve"> </w:t>
+      </w:r>
+      <m:oMath>
+        <m:r>
+          <m:rPr>
+            <m:sty m:val="p"/>
+          </m:rPr>
+          <m:t>Λ</m:t>
+        </m:r>
+        <m:r>
+          <m:rPr>
+            <m:sty m:val="p"/>
+          </m:rPr>
+          <m:t>(</m:t>
+        </m:r>
+        <m:r>
+          <m:t>σ</m:t>
+        </m:r>
+        <m:r>
+          <m:rPr>
+            <m:sty m:val="p"/>
+          </m:rPr>
+          <m:t>−</m:t>
+        </m:r>
+        <m:r>
+          <m:t>i</m:t>
+        </m:r>
+        <m:r>
+          <m:t>t</m:t>
+        </m:r>
+        <m:r>
+          <m:rPr>
+            <m:sty m:val="p"/>
+          </m:rPr>
+          <m:t>)</m:t>
+        </m:r>
+        <m:r>
+          <m:rPr>
+            <m:sty m:val="p"/>
+          </m:rPr>
+          <m:t>=</m:t>
+        </m:r>
+        <m:r>
+          <m:t>0</m:t>
+        </m:r>
+      </m:oMath>
+      <w:r>
         <w:t xml:space="preserve">, then</w:t>
       </w:r>
       <w:r>
@@ -3449,13 +3502,34 @@
       </w:pPr>
       <m:oMath>
         <m:r>
+          <m:rPr>
+            <m:sty m:val="p"/>
+          </m:rPr>
+          <m:t>(</m:t>
+        </m:r>
+        <m:r>
+          <m:t>1</m:t>
+        </m:r>
+        <m:r>
+          <m:rPr>
+            <m:sty m:val="p"/>
+          </m:rPr>
+          <m:t>−</m:t>
+        </m:r>
+        <m:r>
           <m:t>σ</m:t>
         </m:r>
         <m:r>
           <m:rPr>
             <m:sty m:val="p"/>
           </m:rPr>
-          <m:t>−</m:t>
+          <m:t>)</m:t>
+        </m:r>
+        <m:r>
+          <m:rPr>
+            <m:sty m:val="p"/>
+          </m:rPr>
+          <m:t>+</m:t>
         </m:r>
         <m:r>
           <m:t>i</m:t>
@@ -3477,7 +3551,7 @@
             <m:nor/>
             <m:sty m:val="p"/>
           </m:rPr>
-          <m:t>via Mathlib complex conjugation</m:t>
+          <m:t>via functional equation reflection</m:t>
         </m:r>
         <m:r>
           <m:rPr>
@@ -3497,56 +3571,35 @@
       </w:pPr>
       <m:oMath>
         <m:r>
+          <m:t>σ</m:t>
+        </m:r>
+        <m:r>
+          <m:rPr>
+            <m:sty m:val="p"/>
+          </m:rPr>
+          <m:t>−</m:t>
+        </m:r>
+        <m:r>
+          <m:t>i</m:t>
+        </m:r>
+        <m:r>
+          <m:t>t</m:t>
+        </m:r>
+        <m:r>
+          <m:t> </m:t>
+        </m:r>
+        <m:r>
           <m:rPr>
             <m:sty m:val="p"/>
           </m:rPr>
           <m:t>(</m:t>
         </m:r>
         <m:r>
-          <m:t>1</m:t>
-        </m:r>
-        <m:r>
-          <m:rPr>
-            <m:sty m:val="p"/>
-          </m:rPr>
-          <m:t>−</m:t>
-        </m:r>
-        <m:r>
-          <m:t>σ</m:t>
-        </m:r>
-        <m:r>
-          <m:rPr>
-            <m:sty m:val="p"/>
-          </m:rPr>
-          <m:t>)</m:t>
-        </m:r>
-        <m:r>
-          <m:rPr>
-            <m:sty m:val="p"/>
-          </m:rPr>
-          <m:t>+</m:t>
-        </m:r>
-        <m:r>
-          <m:t>i</m:t>
-        </m:r>
-        <m:r>
-          <m:t>t</m:t>
-        </m:r>
-        <m:r>
-          <m:t> </m:t>
-        </m:r>
-        <m:r>
-          <m:rPr>
-            <m:sty m:val="p"/>
-          </m:rPr>
-          <m:t>(</m:t>
-        </m:r>
-        <m:r>
           <m:rPr>
             <m:nor/>
             <m:sty m:val="p"/>
           </m:rPr>
-          <m:t>via functional equation + complex conjugation</m:t>
+          <m:t>via parameter negation</m:t>
         </m:r>
         <m:r>
           <m:rPr>
@@ -4415,7 +4468,10 @@
         </m:r>
       </m:oMath>
       <w:r>
-        <w:t xml:space="preserve">.</w:t>
+        <w:t xml:space="preserve"> </w:t>
+      </w:r>
+      <w:r>
+        <w:t xml:space="preserve">under critical line norm symmetry.</w:t>
       </w:r>
     </w:p>
     <w:p>
@@ -4777,7 +4833,7 @@
         <w:pStyle w:val="FirstParagraph"/>
       </w:pPr>
       <w:r>
-        <w:t xml:space="preserve">All 20 canonical declarations across 5 mathematical submodules in package</w:t>
+        <w:t xml:space="preserve">All 21 canonical declarations across 5 mathematical submodules in package</w:t>
       </w:r>
       <w:r>
         <w:t xml:space="preserve"> </w:t>
@@ -7124,6 +7180,21 @@
               <w:rPr>
                 <w:rStyle w:val="VerbatimChar"/>
               </w:rPr>
+              <w:t xml:space="preserve">CompletedZetaSymmetry.lean</w:t>
+            </w:r>
+          </w:p>
+        </w:tc>
+        <w:tc>
+          <w:tcPr/>
+          <w:p>
+            <w:pPr>
+              <w:pStyle w:val="Compact"/>
+              <w:jc w:val="left"/>
+            </w:pPr>
+            <w:r>
+              <w:rPr>
+                <w:rStyle w:val="VerbatimChar"/>
+              </w:rPr>
               <w:t xml:space="preserve">completedRiemannZeta_one_sub</w:t>
             </w:r>
           </w:p>
@@ -7152,14 +7223,6 @@
             </w:r>
           </w:p>
         </w:tc>
-        <w:tc>
-          <w:tcPr/>
-          <w:p>
-            <w:pPr>
-              <w:pStyle w:val="Compact"/>
-            </w:pPr>
-          </w:p>
-        </w:tc>
       </w:tr>
       <w:tr>
         <w:tc>
@@ -7298,6 +7361,21 @@
               <w:rPr>
                 <w:rStyle w:val="VerbatimChar"/>
               </w:rPr>
+              <w:t xml:space="preserve">CompletedZetaSymmetry.lean</w:t>
+            </w:r>
+          </w:p>
+        </w:tc>
+        <w:tc>
+          <w:tcPr/>
+          <w:p>
+            <w:pPr>
+              <w:pStyle w:val="Compact"/>
+              <w:jc w:val="left"/>
+            </w:pPr>
+            <w:r>
+              <w:rPr>
+                <w:rStyle w:val="VerbatimChar"/>
+              </w:rPr>
               <w:t xml:space="preserve">completedRiemannZeta_one_sub</w:t>
             </w:r>
           </w:p>
@@ -7326,14 +7404,6 @@
             </w:r>
           </w:p>
         </w:tc>
-        <w:tc>
-          <w:tcPr/>
-          <w:p>
-            <w:pPr>
-              <w:pStyle w:val="Compact"/>
-            </w:pPr>
-          </w:p>
-        </w:tc>
       </w:tr>
       <w:tr>
         <w:tc>
@@ -7389,7 +7459,7 @@
               <w:rPr>
                 <w:rStyle w:val="VerbatimChar"/>
               </w:rPr>
-              <w:t xml:space="preserve">completedRiemannZeta_conj</w:t>
+              <w:t xml:space="preserve">completedRiemannZeta_reflection</w:t>
             </w:r>
           </w:p>
         </w:tc>
@@ -8027,6 +8097,133 @@
                 <w:rStyle w:val="VerbatimChar"/>
               </w:rPr>
               <w:t xml:space="preserve">riemannZeta_ne_zero_on_one_line</w:t>
+            </w:r>
+          </w:p>
+        </w:tc>
+        <w:tc>
+          <w:tcPr/>
+          <w:p>
+            <w:pPr>
+              <w:pStyle w:val="Compact"/>
+              <w:jc w:val="left"/>
+            </w:pPr>
+            <w:r>
+              <w:rPr>
+                <w:rStyle w:val="VerbatimChar"/>
+              </w:rPr>
+              <w:t xml:space="preserve">Nonvanishing.lean</w:t>
+            </w:r>
+          </w:p>
+        </w:tc>
+        <w:tc>
+          <w:tcPr/>
+          <w:p>
+            <w:pPr>
+              <w:pStyle w:val="Compact"/>
+              <w:jc w:val="left"/>
+            </w:pPr>
+            <w:r>
+              <w:rPr>
+                <w:rStyle w:val="VerbatimChar"/>
+              </w:rPr>
+              <w:t xml:space="preserve">riemannZeta_ne_zero_of_one_le_re</w:t>
+            </w:r>
+          </w:p>
+        </w:tc>
+        <w:tc>
+          <w:tcPr/>
+          <w:p>
+            <w:pPr>
+              <w:pStyle w:val="Compact"/>
+              <w:jc w:val="left"/>
+            </w:pPr>
+            <w:r>
+              <w:t xml:space="preserve">Verified (No</w:t>
+            </w:r>
+            <w:r>
+              <w:t xml:space="preserve"> </w:t>
+            </w:r>
+            <w:r>
+              <w:rPr>
+                <w:rStyle w:val="VerbatimChar"/>
+              </w:rPr>
+              <w:t xml:space="preserve">sorryAx</w:t>
+            </w:r>
+            <w:r>
+              <w:t xml:space="preserve">)</w:t>
+            </w:r>
+          </w:p>
+        </w:tc>
+      </w:tr>
+      <w:tr>
+        <w:tc>
+          <w:tcPr/>
+          <w:p>
+            <w:pPr>
+              <w:pStyle w:val="Compact"/>
+              <w:jc w:val="left"/>
+            </w:pPr>
+            <w:r>
+              <w:t xml:space="preserve">Totalized</w:t>
+            </w:r>
+            <w:r>
+              <w:t xml:space="preserve"> </w:t>
+            </w:r>
+            <m:oMath>
+              <m:r>
+                <m:t>ζ</m:t>
+              </m:r>
+              <m:r>
+                <m:rPr>
+                  <m:sty m:val="p"/>
+                </m:rPr>
+                <m:t>(</m:t>
+              </m:r>
+              <m:r>
+                <m:t>1</m:t>
+              </m:r>
+              <m:r>
+                <m:rPr>
+                  <m:sty m:val="p"/>
+                </m:rPr>
+                <m:t>+</m:t>
+              </m:r>
+              <m:r>
+                <m:t>i</m:t>
+              </m:r>
+              <m:r>
+                <m:t>t</m:t>
+              </m:r>
+              <m:r>
+                <m:rPr>
+                  <m:sty m:val="p"/>
+                </m:rPr>
+                <m:t>)</m:t>
+              </m:r>
+              <m:r>
+                <m:rPr>
+                  <m:sty m:val="p"/>
+                </m:rPr>
+                <m:t>≠</m:t>
+              </m:r>
+              <m:r>
+                <m:t>0</m:t>
+              </m:r>
+            </m:oMath>
+          </w:p>
+        </w:tc>
+        <w:tc>
+          <w:tcPr/>
+          <w:p>
+            <w:pPr>
+              <w:pStyle w:val="Compact"/>
+              <w:jc w:val="left"/>
+            </w:pPr>
+            <w:r>
+              <w:rPr>
+                <w:rStyle w:val="VerbatimChar"/>
+              </w:rPr>
+              <w:t xml:space="preserve">riemannZeta_ne_zero_totalized</w:t>
             </w:r>
           </w:p>
         </w:tc>

</xml_diff>